<commit_message>
Fix RMS ratio: 1.49x -> 1.44x (arithmetic correction)
0.1182 / 0.0821 = 1.440, not 1.49. The 1.49 value was the L=24 ratio
(from L24_convergence.txt: "L=24 ratio to Riemann: 1.488x") incorrectly
carried forward as the L=30 ratio. Fixed in 6 locations across the paper
and in README.

Co-Authored-By: Claude Opus 4.6 <noreply@anthropic.com>
</commit_message>
<xml_diff>
--- a/Paper_6.docx
+++ b/Paper_6.docx
@@ -109,7 +109,7 @@
         <w:rPr>
           <w:color w:val="000000"/>
         </w:rPr>
-        <w:t>Threading Peierls flux Φ = 1/6 per triangular plaquette — one P-gate phase advance per Floquet step — drives spectral statistics from GOE to GUE: KS(GUE) = 0.052, p = 0.57 at L = 18. Pair correlation RMS vs Montgomery formula = 0.118 at L = 30, ratio 1.49× to Riemann zeros. The transition is a Dyson symmetry transition: quasiperiodic cascade (λ = 0, Floquet angles 0.690π, 0.700π) is ergodic by Weyl equidistribution; P-gate flux breaks the accidental antiunitary symmetry; Wigner-Dyson universality gives GUE.</w:t>
+        <w:t>Threading Peierls flux Φ = 1/6 per triangular plaquette — one P-gate phase advance per Floquet step — drives spectral statistics from GOE to GUE: KS(GUE) = 0.052, p = 0.57 at L = 18. Pair correlation RMS vs Montgomery formula = 0.118 at L = 30, ratio 1.44× to Riemann zeros. The transition is a Dyson symmetry transition: quasiperiodic cascade (λ = 0, Floquet angles 0.690π, 0.700π) is ergodic by Weyl equidistribution; P-gate flux breaks the accidental antiunitary symmetry; Wigner-Dyson universality gives GUE.</w:t>
       </w:r>
     </w:p>
     <w:p>
@@ -177,7 +177,7 @@
         <w:rPr>
           <w:color w:val="000000"/>
         </w:rPr>
-        <w:t>This paper reports Analyses 14–27 of the Merkabit Riemann spectral program. The central results are: (1) a GOE → GUE transition under P-gate Peierls flux with pair correlation RMS ratio 1.49× to the Riemann zeros; (2) the identification of the P gate as the affine node of A₄⁽¹⁾; (3) the closure of Route C — the derivation of α⁻¹ = 137.036 from rank(E₆) = 6, h(E₆) = 12, and n_gates = 5 with zero free parameters; and (4) the Euler product connection — M fits the Dedekind zeta ζ_{Q(ω)} = ζ(s)·L(s,χ₋₃) better than ζ(s) alone by 28.4%, consistent with M living on ℤ[ω].</w:t>
+        <w:t>This paper reports Analyses 14–27 of the Merkabit Riemann spectral program. The central results are: (1) a GOE → GUE transition under P-gate Peierls flux with pair correlation RMS ratio 1.44× to the Riemann zeros; (2) the identification of the P gate as the affine node of A₄⁽¹⁾; (3) the closure of Route C — the derivation of α⁻¹ = 137.036 from rank(E₆) = 6, h(E₆) = 12, and n_gates = 5 with zero free parameters; and (4) the Euler product connection — M fits the Dedekind zeta ζ_{Q(ω)} = ζ(s)·L(s,χ₋₃) better than ζ(s) alone by 28.4%, consistent with M living on ℤ[ω].</w:t>
       </w:r>
     </w:p>
     <w:p>
@@ -6168,7 +6168,7 @@
           <w:szCs w:val="20"/>
         </w:rPr>
         <w:lastRenderedPageBreak/>
-        <w:t>Table 6. Convergence of pair correlation RMS toward the Riemann zero benchmark (0.082) as torus size increases. L = 27 shows a bump consistent with the Coxeter standing-wave pattern: 27 mod 12 = 3 (incommensurate). L = 30 recovers to best RMS = 0.118. RMS ratio to Riemann zeros: 1.49×.</w:t>
+        <w:t>Table 6. Convergence of pair correlation RMS toward the Riemann zero benchmark (0.082) as torus size increases. L = 27 shows a bump consistent with the Coxeter standing-wave pattern: 27 mod 12 = 3 (incommensurate). L = 30 recovers to best RMS = 0.118. RMS ratio to Riemann zeros: 1.44×.</w:t>
       </w:r>
     </w:p>
     <w:p/>
@@ -6181,7 +6181,7 @@
         <w:rPr>
           <w:color w:val="000000"/>
         </w:rPr>
-        <w:t>The non-monotonic bump at L = 27 is consistent with the Coxeter standing-wave pattern identified in Section 5.4. The values L mod 12 = 3 (L = 15, 27) consistently show slightly elevated RMS compared to adjacent sizes. The overall trend is convergence: RMS decreasing from 0.163 at L = 12 to 0.118 at L = 30, with ratio to Riemann zeros improving from 1.99× to 1.49×.</w:t>
+        <w:t>The non-monotonic bump at L = 27 is consistent with the Coxeter standing-wave pattern identified in Section 5.4. The values L mod 12 = 3 (L = 15, 27) consistently show slightly elevated RMS compared to adjacent sizes. The overall trend is convergence: RMS decreasing from 0.163 at L = 12 to 0.118 at L = 30, with ratio to Riemann zeros improving from 1.99× to 1.44×.</w:t>
       </w:r>
     </w:p>
     <w:p>
@@ -7892,7 +7892,7 @@
         <w:rPr>
           <w:color w:val="000000"/>
         </w:rPr>
-        <w:t>At Φ = 1/6, M is time-reversal-odd in the same sense as H = xp. It is in the GUE symmetry class by the Dyson argument above. Its pair correlation converges toward the Montgomery formula with ratio 1.49 to the Riemann zeros at matched sample size. The construction has zero free parameters.</w:t>
+        <w:t>At Φ = 1/6, M is time-reversal-odd in the same sense as H = xp. It is in the GUE symmetry class by the Dyson argument above. Its pair correlation converges toward the Montgomery formula with ratio 1.44 to the Riemann zeros at matched sample size. The construction has zero free parameters.</w:t>
       </w:r>
     </w:p>
     <w:p>
@@ -8360,7 +8360,7 @@
                 <w:sz w:val="20"/>
                 <w:szCs w:val="20"/>
               </w:rPr>
-              <w:t>Montgomery pair correlation: RMS(M)/RMS(Riemann) = 1.49× at L = 30</w:t>
+              <w:t>Montgomery pair correlation: RMS(M)/RMS(Riemann) = 1.44× at L = 30</w:t>
             </w:r>
           </w:p>
         </w:tc>
@@ -9087,7 +9087,7 @@
         <w:rPr>
           <w:color w:val="000000"/>
         </w:rPr>
-        <w:t>The transition is a Dyson symmetry transition. The cascade is a quasiperiodic rotation on S³ × S³ with irrational Floquet angles 0.690π and 0.700π — confirmed ergodic by the Weyl equidistribution theorem. Symmetry breaking plus ergodicity gives GUE by the Wigner-Dyson universality theorem. The pair correlation of M's eigenvalues matches the Montgomery formula with RMS = 0.118 at L = 30, ratio 1.49× to the Riemann zeros.</w:t>
+        <w:t>The transition is a Dyson symmetry transition. The cascade is a quasiperiodic rotation on S³ × S³ with irrational Floquet angles 0.690π and 0.700π — confirmed ergodic by the Weyl equidistribution theorem. Symmetry breaking plus ergodicity gives GUE by the Wigner-Dyson universality theorem. The pair correlation of M's eigenvalues matches the Montgomery formula with RMS = 0.118 at L = 30, ratio 1.44× to the Riemann zeros.</w:t>
       </w:r>
     </w:p>
     <w:p>

</xml_diff>

<commit_message>
Fix 5 paper errors: p-value cap, E6 roots label, Analysis 21 numbering, Floquet angle precision, B²_F derivation
- Issue 2: p = 1.13 (impossible KS p-value) → "p > 0.5"
- Issue 3: "E₆ positive roots / total roots" → "E₆ positive roots / V²" (36/100, not 36/72)
- Issue 4: Section 5.6 "Analysis 21" → "Analysis 20b" (convergence scaling is part of Analysis 20)
- Issue 5: Floquet angles 0.690π, 0.700π → 0.6901π, 0.7003π (actual computed values); rationality claim softened
- Issue 6: Added B²_F = 2(2n)² = 200 alongside B²_P = 549

Co-Authored-By: Claude Opus 4.6 <noreply@anthropic.com>
</commit_message>
<xml_diff>
--- a/Paper_6.docx
+++ b/Paper_6.docx
@@ -109,7 +109,7 @@
         <w:rPr>
           <w:color w:val="000000"/>
         </w:rPr>
-        <w:t>Threading Peierls flux Φ = 1/6 per triangular plaquette — one P-gate phase advance per Floquet step — drives spectral statistics from GOE to GUE: KS(GUE) = 0.052, p = 0.57 at L = 18. Pair correlation RMS vs Montgomery formula = 0.118 at L = 30, ratio 1.44× to Riemann zeros. The transition is a Dyson symmetry transition: quasiperiodic cascade (λ = 0, Floquet angles 0.690π, 0.700π) is ergodic by Weyl equidistribution; P-gate flux breaks the accidental antiunitary symmetry; Wigner-Dyson universality gives GUE.</w:t>
+        <w:t>Threading Peierls flux Φ = 1/6 per triangular plaquette — one P-gate phase advance per Floquet step — drives spectral statistics from GOE to GUE: KS(GUE) = 0.052, p = 0.57 at L = 18. Pair correlation RMS vs Montgomery formula = 0.118 at L = 30, ratio 1.44× to Riemann zeros. The transition is a Dyson symmetry transition: quasiperiodic cascade (λ = 0, Floquet angles 0.6901π, 0.7003π) is ergodic by Weyl equidistribution; P-gate flux breaks the accidental antiunitary symmetry; Wigner-Dyson universality gives GUE.</w:t>
       </w:r>
     </w:p>
     <w:p>
@@ -2274,7 +2274,7 @@
         <w:jc w:val="both"/>
       </w:pPr>
       <w:r>
-        <w:t xml:space="preserve">  • 36/100 = 0.36000    (E₆ positive roots / total roots, Δ = 0.0013)</w:t>
+        <w:t xml:space="preserve">  • 36/100 = 0.36000    (E₆ positive roots / V², Δ = 0.0013)</w:t>
       </w:r>
     </w:p>
     <w:p>
@@ -4768,7 +4768,7 @@
         <w:pStyle w:val="Heading2"/>
       </w:pPr>
       <w:r>
-        <w:t>5.6 Analysis 21: Convergence Scaling L = 12 to L = 30</w:t>
+        <w:t>5.6 Analysis 20b: Convergence Scaling L = 12 to L = 30</w:t>
       </w:r>
     </w:p>
     <w:p>
@@ -6213,7 +6213,7 @@
         <w:rPr>
           <w:color w:val="000000"/>
         </w:rPr>
-        <w:t>The result KS(GUE) = 0.049, p = 1.13 reproduces Analysis 19 (KS = 0.052, p = 0.57) within statistical precision, confirming the Peierls construction. The Dedekind comparison at L = 18 gave RMS(M, Dedekind) = 0.359 versus RMS(M, Riemann) = 0.335 — a 7% disadvantage for Dedekind. This reversal relative to L = 30 is a finite-size effect: with only 130 positive-wing eigenvalues at L = 18, the pair correlation cannot resolve the double density of the Dedekind zero set. The reversal motivated the definitive L = 30 test reported in Section 5.8.</w:t>
+        <w:t>The result KS(GUE) = 0.049, p &gt; 0.5, reproduces Analysis 19 (KS = 0.052, p = 0.57) within statistical precision, confirming the Peierls construction. The Dedekind comparison at L = 18 gave RMS(M, Dedekind) = 0.359 versus RMS(M, Riemann) = 0.335 — a 7% disadvantage for Dedekind. This reversal relative to L = 30 is a finite-size effect: with only 130 positive-wing eigenvalues at L = 18, the pair correlation cannot resolve the double density of the Dedekind zero set. The reversal motivated the definitive L = 30 test reported in Section 5.8.</w:t>
       </w:r>
     </w:p>
     <w:p/>
@@ -6755,7 +6755,7 @@
         <w:rPr>
           <w:color w:val="000000"/>
         </w:rPr>
-        <w:t>This ergodicity follows from the quasiperiodic nature of the cascade. The 12-step Floquet operator has eigenvalues exp(±i · 0.690π) for the forward spinor and exp(±i · 0.700π) for the inverse spinor. Both angles are irrational multiples of π — confirmed numerically by the absence of rational approximations with denominator below 200. Two incommensurate irrational frequencies on a torus produce a dense orbit: by the Weyl equidistribution theorem, the time-average of any continuous observable equals its space-average over the invariant torus. This is unique ergodicity.</w:t>
+        <w:t>This ergodicity follows from the quasiperiodic nature of the cascade. The 12-step Floquet operator has eigenvalues exp(±i · 0.6901π) for the forward spinor and exp(±i · 0.7003π) for the inverse spinor. Both angles are irrational multiples of π — confirmed numerically by the absence of low-denominator rational approximations (best rational approximations have denominators &gt; 70). Two incommensurate irrational frequencies on a torus produce a dense orbit: by the Weyl equidistribution theorem, the time-average of any continuous observable equals its space-average over the invariant torus. This is unique ergodicity.</w:t>
       </w:r>
     </w:p>
     <w:p>
@@ -7812,7 +7812,7 @@
         <w:jc w:val="both"/>
       </w:pPr>
       <w:r>
-        <w:t xml:space="preserve">  → gate magnitudes: B²_P = (h+3)² + (3r)² = 549</w:t>
+        <w:t xml:space="preserve">  → gate magnitudes: B²_P = (h+3)² + (3r)² = 549,  B²_F = 2(2n)² = 200</w:t>
       </w:r>
     </w:p>
     <w:p>
@@ -8232,7 +8232,7 @@
                 <w:sz w:val="20"/>
                 <w:szCs w:val="20"/>
               </w:rPr>
-              <w:t>Ergodicity from quasiperiodic irrational Floquet angles (0.690π, 0.700π)</w:t>
+              <w:t>Ergodicity from quasiperiodic irrational Floquet angles (0.6901π, 0.7003π)</w:t>
             </w:r>
           </w:p>
         </w:tc>
@@ -8260,7 +8260,7 @@
                 <w:sz w:val="20"/>
                 <w:szCs w:val="20"/>
               </w:rPr>
-              <w:t>CONFIRMED — Weyl equidistribution, no rational approximation below denom 200</w:t>
+              <w:t>CONFIRMED — Weyl equidistribution, best rational approximations have denom &gt; 70</w:t>
             </w:r>
           </w:p>
         </w:tc>
@@ -9087,7 +9087,7 @@
         <w:rPr>
           <w:color w:val="000000"/>
         </w:rPr>
-        <w:t>The transition is a Dyson symmetry transition. The cascade is a quasiperiodic rotation on S³ × S³ with irrational Floquet angles 0.690π and 0.700π — confirmed ergodic by the Weyl equidistribution theorem. Symmetry breaking plus ergodicity gives GUE by the Wigner-Dyson universality theorem. The pair correlation of M's eigenvalues matches the Montgomery formula with RMS = 0.118 at L = 30, ratio 1.44× to the Riemann zeros.</w:t>
+        <w:t>The transition is a Dyson symmetry transition. The cascade is a quasiperiodic rotation on S³ × S³ with irrational Floquet angles 0.6901π and 0.7003π — confirmed ergodic by the Weyl equidistribution theorem. Symmetry breaking plus ergodicity gives GUE by the Wigner-Dyson universality theorem. The pair correlation of M's eigenvalues matches the Montgomery formula with RMS = 0.118 at L = 30, ratio 1.44× to the Riemann zeros.</w:t>
       </w:r>
     </w:p>
     <w:p>

</xml_diff>

<commit_message>
Add 5 figures to Paper 6: pair correlation, convergence, phi sweep, GOE→GUE, Dedekind
- Fig 1: g(r) at L=30 vs Riemann zeros vs Montgomery conjecture (Section 5.5)
- Fig 2: RMS convergence scaling L=12 to L=30 with power-law fit (Section 5.6)
- Fig 3: Phi sweep showing RMS minimum at Φ=1/6 (Section 5.2)
- Fig 4: GOE→GUE spacing distributions at Φ=0 vs Φ=1/6 (Section 5.2)
- Fig 5: Dedekind vs Riemann residuals, 28.4% improvement (Section 5.8)
- Added generate_paper_figures.py for reproducibility

Co-Authored-By: Claude Opus 4.6 <noreply@anthropic.com>
</commit_message>
<xml_diff>
--- a/Paper_6.docx
+++ b/Paper_6.docx
@@ -3623,6 +3623,132 @@
     </w:p>
     <w:p>
       <w:pPr>
+        <w:spacing w:before="240" w:after="60"/>
+        <w:jc w:val="center"/>
+      </w:pPr>
+      <w:r>
+        <w:rPr>
+          <w:noProof/>
+        </w:rPr>
+        <w:drawing>
+          <wp:inline xmlns:wp="http://schemas.openxmlformats.org/drawingml/2006/wordprocessingDrawing" distT="0" distB="0" distL="0" distR="0">
+            <wp:extent cx="5029200" cy="1885950"/>
+            <wp:docPr id="103" name="Figure 3"/>
+            <a:graphic xmlns:a="http://schemas.openxmlformats.org/drawingml/2006/main">
+              <a:graphicData uri="http://schemas.openxmlformats.org/drawingml/2006/picture">
+                <pic:pic xmlns:pic="http://schemas.openxmlformats.org/drawingml/2006/picture">
+                  <pic:nvPicPr>
+                    <pic:cNvPr id="103" name="image3.png"/>
+                    <pic:cNvPicPr/>
+                  </pic:nvPicPr>
+                  <pic:blipFill>
+                    <a:blip xmlns:r="http://schemas.openxmlformats.org/officeDocument/2006/relationships" r:embed="rId12"/>
+                    <a:stretch>
+                      <a:fillRect/>
+                    </a:stretch>
+                  </pic:blipFill>
+                  <pic:spPr>
+                    <a:xfrm>
+                      <a:off x="0" y="0"/>
+                      <a:ext cx="5029200" cy="1885950"/>
+                    </a:xfrm>
+                    <a:prstGeom prst="rect">
+                      <a:avLst/>
+                    </a:prstGeom>
+                  </pic:spPr>
+                </pic:pic>
+              </a:graphicData>
+            </a:graphic>
+          </wp:inline>
+        </w:drawing>
+      </w:r>
+    </w:p>
+    <w:p>
+      <w:pPr>
+        <w:spacing w:before="60" w:after="240"/>
+        <w:jc w:val="center"/>
+      </w:pPr>
+      <w:r>
+        <w:rPr>
+          <w:b/>
+          <w:sz w:val="20"/>
+          <w:szCs w:val="20"/>
+        </w:rPr>
+        <w:t xml:space="preserve">Figure 3. </w:t>
+      </w:r>
+      <w:r>
+        <w:rPr>
+          <w:sz w:val="20"/>
+          <w:szCs w:val="20"/>
+        </w:rPr>
+        <w:t>Phi sweep at L = 18. RMS vs Montgomery as a function of Peierls flux per plaquette. The minimum at phi = 1/6 corresponds to one P-gate phase advance per Floquet step.</w:t>
+      </w:r>
+    </w:p>
+    <w:p>
+      <w:pPr>
+        <w:spacing w:before="240" w:after="60"/>
+        <w:jc w:val="center"/>
+      </w:pPr>
+      <w:r>
+        <w:rPr>
+          <w:noProof/>
+        </w:rPr>
+        <w:drawing>
+          <wp:inline xmlns:wp="http://schemas.openxmlformats.org/drawingml/2006/wordprocessingDrawing" distT="0" distB="0" distL="0" distR="0">
+            <wp:extent cx="5029200" cy="1796142"/>
+            <wp:docPr id="104" name="Figure 4"/>
+            <a:graphic xmlns:a="http://schemas.openxmlformats.org/drawingml/2006/main">
+              <a:graphicData uri="http://schemas.openxmlformats.org/drawingml/2006/picture">
+                <pic:pic xmlns:pic="http://schemas.openxmlformats.org/drawingml/2006/picture">
+                  <pic:nvPicPr>
+                    <pic:cNvPr id="104" name="image4.png"/>
+                    <pic:cNvPicPr/>
+                  </pic:nvPicPr>
+                  <pic:blipFill>
+                    <a:blip xmlns:r="http://schemas.openxmlformats.org/officeDocument/2006/relationships" r:embed="rId13"/>
+                    <a:stretch>
+                      <a:fillRect/>
+                    </a:stretch>
+                  </pic:blipFill>
+                  <pic:spPr>
+                    <a:xfrm>
+                      <a:off x="0" y="0"/>
+                      <a:ext cx="5029200" cy="1796142"/>
+                    </a:xfrm>
+                    <a:prstGeom prst="rect">
+                      <a:avLst/>
+                    </a:prstGeom>
+                  </pic:spPr>
+                </pic:pic>
+              </a:graphicData>
+            </a:graphic>
+          </wp:inline>
+        </w:drawing>
+      </w:r>
+    </w:p>
+    <w:p>
+      <w:pPr>
+        <w:spacing w:before="60" w:after="240"/>
+        <w:jc w:val="center"/>
+      </w:pPr>
+      <w:r>
+        <w:rPr>
+          <w:b/>
+          <w:sz w:val="20"/>
+          <w:szCs w:val="20"/>
+        </w:rPr>
+        <w:t xml:space="preserve">Figure 4. </w:t>
+      </w:r>
+      <w:r>
+        <w:rPr>
+          <w:sz w:val="20"/>
+          <w:szCs w:val="20"/>
+        </w:rPr>
+        <w:t>GOE to GUE transition. Nearest-neighbor spacing distributions at phi = 0 (left, GOE-consistent) and phi = 1/6 (right, GUE-consistent), with Wigner surmise overlays.</w:t>
+      </w:r>
+    </w:p>
+    <w:p>
+      <w:pPr>
         <w:pStyle w:val="Heading2"/>
       </w:pPr>
       <w:r>
@@ -4761,6 +4887,69 @@
           <w:color w:val="000000"/>
         </w:rPr>
         <w:t>The Phi sweep confirms that Φ = 1/6 specifically minimizes the RMS distance to the Montgomery formula. The RMS is 0.260 at Φ = 0 (worst), 0.135 at Φ = 1/6 (minimum), and 0.185 at Φ = 1/3, forming a V-shape with the minimum at the P-gate flux. The Montgomery match specifically requires the P-gate flux — no other flux value achieves comparable agreement.</w:t>
+      </w:r>
+    </w:p>
+    <w:p>
+      <w:pPr>
+        <w:spacing w:before="240" w:after="60"/>
+        <w:jc w:val="center"/>
+      </w:pPr>
+      <w:r>
+        <w:rPr>
+          <w:noProof/>
+        </w:rPr>
+        <w:drawing>
+          <wp:inline xmlns:wp="http://schemas.openxmlformats.org/drawingml/2006/wordprocessingDrawing" distT="0" distB="0" distL="0" distR="0">
+            <wp:extent cx="5029200" cy="3214063"/>
+            <wp:docPr id="101" name="Figure 1"/>
+            <a:graphic xmlns:a="http://schemas.openxmlformats.org/drawingml/2006/main">
+              <a:graphicData uri="http://schemas.openxmlformats.org/drawingml/2006/picture">
+                <pic:pic xmlns:pic="http://schemas.openxmlformats.org/drawingml/2006/picture">
+                  <pic:nvPicPr>
+                    <pic:cNvPr id="101" name="image1.png"/>
+                    <pic:cNvPicPr/>
+                  </pic:nvPicPr>
+                  <pic:blipFill>
+                    <a:blip xmlns:r="http://schemas.openxmlformats.org/officeDocument/2006/relationships" r:embed="rId10"/>
+                    <a:stretch>
+                      <a:fillRect/>
+                    </a:stretch>
+                  </pic:blipFill>
+                  <pic:spPr>
+                    <a:xfrm>
+                      <a:off x="0" y="0"/>
+                      <a:ext cx="5029200" cy="3214063"/>
+                    </a:xfrm>
+                    <a:prstGeom prst="rect">
+                      <a:avLst/>
+                    </a:prstGeom>
+                  </pic:spPr>
+                </pic:pic>
+              </a:graphicData>
+            </a:graphic>
+          </wp:inline>
+        </w:drawing>
+      </w:r>
+    </w:p>
+    <w:p>
+      <w:pPr>
+        <w:spacing w:before="60" w:after="240"/>
+        <w:jc w:val="center"/>
+      </w:pPr>
+      <w:r>
+        <w:rPr>
+          <w:b/>
+          <w:sz w:val="20"/>
+          <w:szCs w:val="20"/>
+        </w:rPr>
+        <w:t xml:space="preserve">Figure 1. </w:t>
+      </w:r>
+      <w:r>
+        <w:rPr>
+          <w:sz w:val="20"/>
+          <w:szCs w:val="20"/>
+        </w:rPr>
+        <w:t>Pair correlation g(r) of the M operator at L = 30, compared with the first 1000 Riemann zeta zeros and the Montgomery conjecture 1 - (sin pi r / pi r)^2. RMS values are computed over r in [0, 4].</w:t>
       </w:r>
     </w:p>
     <w:p>
@@ -6186,6 +6375,69 @@
     </w:p>
     <w:p>
       <w:pPr>
+        <w:spacing w:before="240" w:after="60"/>
+        <w:jc w:val="center"/>
+      </w:pPr>
+      <w:r>
+        <w:rPr>
+          <w:noProof/>
+        </w:rPr>
+        <w:drawing>
+          <wp:inline xmlns:wp="http://schemas.openxmlformats.org/drawingml/2006/wordprocessingDrawing" distT="0" distB="0" distL="0" distR="0">
+            <wp:extent cx="5029200" cy="3044870"/>
+            <wp:docPr id="102" name="Figure 2"/>
+            <a:graphic xmlns:a="http://schemas.openxmlformats.org/drawingml/2006/main">
+              <a:graphicData uri="http://schemas.openxmlformats.org/drawingml/2006/picture">
+                <pic:pic xmlns:pic="http://schemas.openxmlformats.org/drawingml/2006/picture">
+                  <pic:nvPicPr>
+                    <pic:cNvPr id="102" name="image2.png"/>
+                    <pic:cNvPicPr/>
+                  </pic:nvPicPr>
+                  <pic:blipFill>
+                    <a:blip xmlns:r="http://schemas.openxmlformats.org/officeDocument/2006/relationships" r:embed="rId11"/>
+                    <a:stretch>
+                      <a:fillRect/>
+                    </a:stretch>
+                  </pic:blipFill>
+                  <pic:spPr>
+                    <a:xfrm>
+                      <a:off x="0" y="0"/>
+                      <a:ext cx="5029200" cy="3044870"/>
+                    </a:xfrm>
+                    <a:prstGeom prst="rect">
+                      <a:avLst/>
+                    </a:prstGeom>
+                  </pic:spPr>
+                </pic:pic>
+              </a:graphicData>
+            </a:graphic>
+          </wp:inline>
+        </w:drawing>
+      </w:r>
+    </w:p>
+    <w:p>
+      <w:pPr>
+        <w:spacing w:before="60" w:after="240"/>
+        <w:jc w:val="center"/>
+      </w:pPr>
+      <w:r>
+        <w:rPr>
+          <w:b/>
+          <w:sz w:val="20"/>
+          <w:szCs w:val="20"/>
+        </w:rPr>
+        <w:t xml:space="preserve">Figure 2. </w:t>
+      </w:r>
+      <w:r>
+        <w:rPr>
+          <w:sz w:val="20"/>
+          <w:szCs w:val="20"/>
+        </w:rPr>
+        <w:t>Convergence of RMS vs Montgomery as a function of lattice size L. The red line shows the Riemann zero benchmark (N = 1000). The ratio M/Riemann improves from 1.99x at L = 12 to 1.44x at L = 30.</w:t>
+      </w:r>
+    </w:p>
+    <w:p>
+      <w:pPr>
         <w:pStyle w:val="Heading2"/>
       </w:pPr>
       <w:r>
@@ -6671,6 +6923,69 @@
       </w:pPr>
       <w:r>
         <w:t>This is consistent with the Euler product structure: M lives on ℤ[ω], so its spectral statistics naturally match ζℚ(ω)(s), not ζ(s) alone. The 28.4% improvement is the spectral signature of the Eisenstein arithmetic structure of M. The definitive test requires L ≥ 42 (approximately 700 positive-wing eigenvalues), where the double density of ζℚ(ω) becomes resolvable at bandwidth 0.4 and the correlation hole depths separate sufficiently to distinguish the two candidates.</w:t>
+      </w:r>
+    </w:p>
+    <w:p>
+      <w:pPr>
+        <w:spacing w:before="240" w:after="60"/>
+        <w:jc w:val="center"/>
+      </w:pPr>
+      <w:r>
+        <w:rPr>
+          <w:noProof/>
+        </w:rPr>
+        <w:drawing>
+          <wp:inline xmlns:wp="http://schemas.openxmlformats.org/drawingml/2006/wordprocessingDrawing" distT="0" distB="0" distL="0" distR="0">
+            <wp:extent cx="5029200" cy="3014216"/>
+            <wp:docPr id="105" name="Figure 5"/>
+            <a:graphic xmlns:a="http://schemas.openxmlformats.org/drawingml/2006/main">
+              <a:graphicData uri="http://schemas.openxmlformats.org/drawingml/2006/picture">
+                <pic:pic xmlns:pic="http://schemas.openxmlformats.org/drawingml/2006/picture">
+                  <pic:nvPicPr>
+                    <pic:cNvPr id="105" name="image5.png"/>
+                    <pic:cNvPicPr/>
+                  </pic:nvPicPr>
+                  <pic:blipFill>
+                    <a:blip xmlns:r="http://schemas.openxmlformats.org/officeDocument/2006/relationships" r:embed="rId14"/>
+                    <a:stretch>
+                      <a:fillRect/>
+                    </a:stretch>
+                  </pic:blipFill>
+                  <pic:spPr>
+                    <a:xfrm>
+                      <a:off x="0" y="0"/>
+                      <a:ext cx="5029200" cy="3014216"/>
+                    </a:xfrm>
+                    <a:prstGeom prst="rect">
+                      <a:avLst/>
+                    </a:prstGeom>
+                  </pic:spPr>
+                </pic:pic>
+              </a:graphicData>
+            </a:graphic>
+          </wp:inline>
+        </w:drawing>
+      </w:r>
+    </w:p>
+    <w:p>
+      <w:pPr>
+        <w:spacing w:before="60" w:after="240"/>
+        <w:jc w:val="center"/>
+      </w:pPr>
+      <w:r>
+        <w:rPr>
+          <w:b/>
+          <w:sz w:val="20"/>
+          <w:szCs w:val="20"/>
+        </w:rPr>
+        <w:t xml:space="preserve">Figure 5. </w:t>
+      </w:r>
+      <w:r>
+        <w:rPr>
+          <w:sz w:val="20"/>
+          <w:szCs w:val="20"/>
+        </w:rPr>
+        <w:t>Dedekind comparison at L = 30. Residuals g_M(r) - g_ref(r) for Riemann zeta (solid red) and Dedekind zeta of Q(omega) (dashed purple). The Dedekind zeta gives 28.4% lower RMS, consistent with M's Eisenstein lattice arithmetic.</w:t>
       </w:r>
     </w:p>
     <w:p>

</xml_diff>